<commit_message>
Reproduce the session_hand6 reference bundle pipeline and regenerate materials
</commit_message>
<xml_diff>
--- a/copyright/generated/01_登记信息填表稿.docx
+++ b/copyright/generated/01_登记信息填表稿.docx
@@ -79,7 +79,12 @@
     </w:p>
     <w:p>
       <w:r>
-        <w:t>约束、一对一手部匹配、固定规则 MANO 缝合、三阶段结果导出、重载与拓扑检查、静态对比报告。</w:t>
+        <w:t>约束、一对一手部匹配、有界腕点及轮廓候选优化、MANO 融合与局部谐波表面连接、三阶段结果导出、</w:t>
+      </w:r>
+    </w:p>
+    <w:p>
+      <w:r>
+        <w:t>重载与拓扑检查、静态对比报告。</w:t>
       </w:r>
     </w:p>
     <w:p>
@@ -99,12 +104,12 @@
     </w:p>
     <w:p>
       <w:r>
-        <w:t>运行环境：Linux；控制器 Python 3.8 以上；模型推理使用 NVIDIA GPU、CUDA 及各自模型环境；身体</w:t>
+        <w:t>运行环境：Linux；控制器 Python 3.8 以上；模型推理使用 NVIDIA GPU、CUDA 及各自模型环境；两阶</w:t>
       </w:r>
     </w:p>
     <w:p>
       <w:r>
-        <w:t>优化采用 CPU。</w:t>
+        <w:t>段身体优化采用 CPU，后续腕点和轮廓优化优先 GPU，局部表面用 CPU 稀疏求解。</w:t>
       </w:r>
     </w:p>
     <w:p>

</xml_diff>

<commit_message>
Integrate MANO-guided body with original seam as default and regenerate V1.0 registration materials
</commit_message>
<xml_diff>
--- a/copyright/generated/01_登记信息填表稿.docx
+++ b/copyright/generated/01_登记信息填表稿.docx
@@ -79,12 +79,12 @@
     </w:p>
     <w:p>
       <w:r>
-        <w:t>约束、一对一手部匹配、有界腕点及轮廓候选优化、MANO 融合与局部谐波表面连接、三阶段结果导出、</w:t>
+        <w:t>约束、一对一手部匹配、有界腕点及轮廓候选优化、MANO 手腕／掌根／腕环辅助身体优化、原接缝融合</w:t>
       </w:r>
     </w:p>
     <w:p>
       <w:r>
-        <w:t>重载与拓扑检查、静态对比报告。</w:t>
+        <w:t>与局部谐波表面连接、四阶段结果导出、重载与拓扑及局部穿插检查、静态对比报告。</w:t>
       </w:r>
     </w:p>
     <w:p>
@@ -109,7 +109,7 @@
     </w:p>
     <w:p>
       <w:r>
-        <w:t>段身体优化采用 CPU，后续腕点和轮廓优化优先 GPU，局部表面用 CPU 稀疏求解。</w:t>
+        <w:t>段身体优化采用 CPU，后续腕点、轮廓和 MANO 辅助身体优化优先 GPU，局部表面用 CPU 稀疏求解。</w:t>
       </w:r>
     </w:p>
     <w:p>

</xml_diff>